<commit_message>
updated maker, checker readme document
</commit_message>
<xml_diff>
--- a/Shahar/PPA-Maker-Checker-README.docx
+++ b/Shahar/PPA-Maker-Checker-README.docx
@@ -1383,7 +1383,7 @@
           <w:sz w:val="20"/>
           <w:szCs w:val="20"/>
         </w:rPr>
-        <w:t xml:space="preserve">The .npmrc file is in the project root. Edit it to point to your Artifactory registry.</w:t>
+        <w:t xml:space="preserve">The .npmrc file is already configured for the Citigroup Artifactory registry. Replace only the ${NPM_AUTH_TOKEN} placeholder with your actual token (see Step 2).</w:t>
       </w:r>
     </w:p>
     <w:p>
@@ -1436,26 +1436,140 @@
           <w:sz w:val="18"/>
           <w:szCs w:val="18"/>
         </w:rPr>
-        <w:t xml:space="preserve">registry=https://your-org.jfrog.io/artifactory/api/npm/npm-local/</w:t>
-      </w:r>
-    </w:p>
-    <w:p>
-      <w:pPr>
-        <w:pBdr>
-          <w:left w:val="single" w:color="1A5276" w:sz="6" w:space="1"/>
-        </w:pBdr>
-        <w:shd w:fill="F4F6F7" w:val="clear"/>
-        <w:spacing w:after="0" w:before="0"/>
-        <w:ind w:left="260" w:right="260"/>
-      </w:pPr>
-      <w:r>
-        <w:rPr>
-          <w:rFonts w:ascii="Courier New" w:cs="Courier New" w:eastAsia="Courier New" w:hAnsi="Courier New"/>
-          <w:color w:val="1A252F"/>
-          <w:sz w:val="18"/>
-          <w:szCs w:val="18"/>
-        </w:rPr>
-        <w:t xml:space="preserve">//your-org.jfrog.io/artifactory/api/npm/npm-local/:_authToken=${NPM_AUTH_TOKEN}</w:t>
+        <w:t xml:space="preserve">registry=https://www.artifactrepository.citigroup.net/artifactory/api/npm/npm-teamdev/</w:t>
+      </w:r>
+    </w:p>
+    <w:p>
+      <w:pPr>
+        <w:pBdr>
+          <w:left w:val="single" w:color="1A5276" w:sz="6" w:space="1"/>
+        </w:pBdr>
+        <w:shd w:fill="F4F6F7" w:val="clear"/>
+        <w:spacing w:after="0" w:before="0"/>
+        <w:ind w:left="260" w:right="260"/>
+      </w:pPr>
+      <w:r>
+        <w:rPr>
+          <w:rFonts w:ascii="Courier New" w:cs="Courier New" w:eastAsia="Courier New" w:hAnsi="Courier New"/>
+          <w:color w:val="1A252F"/>
+          <w:sz w:val="18"/>
+          <w:szCs w:val="18"/>
+        </w:rPr>
+        <w:t xml:space="preserve">//www.artifactrepository.citigroup.net/artifactory/api/npm/npm-teamdev/:_authToken=${NPM_AUTH_TOKEN}</w:t>
+      </w:r>
+    </w:p>
+    <w:p>
+      <w:pPr>
+        <w:pBdr>
+          <w:left w:val="single" w:color="1A5276" w:sz="6" w:space="1"/>
+        </w:pBdr>
+        <w:shd w:fill="F4F6F7" w:val="clear"/>
+        <w:spacing w:after="0" w:before="0"/>
+        <w:ind w:left="260" w:right="260"/>
+      </w:pPr>
+      <w:r>
+        <w:rPr>
+          <w:rFonts w:ascii="Courier New" w:hAnsi="Courier New"/>
+          <w:color w:val="1A252F"/>
+          <w:sz w:val="18"/>
+          <w:szCs w:val="18"/>
+        </w:rPr>
+        <w:t xml:space="preserve">strict-ssl=false</w:t>
+      </w:r>
+    </w:p>
+    <w:p>
+      <w:pPr>
+        <w:pBdr>
+          <w:left w:val="single" w:color="1A5276" w:sz="6" w:space="1"/>
+        </w:pBdr>
+        <w:shd w:fill="F4F6F7" w:val="clear"/>
+        <w:spacing w:after="0" w:before="0"/>
+        <w:ind w:left="260" w:right="260"/>
+      </w:pPr>
+      <w:r>
+        <w:rPr>
+          <w:rFonts w:ascii="Courier New" w:hAnsi="Courier New"/>
+          <w:color w:val="1A252F"/>
+          <w:sz w:val="18"/>
+          <w:szCs w:val="18"/>
+        </w:rPr>
+        <w:t xml:space="preserve">email=ss71872@citi.com</w:t>
+      </w:r>
+    </w:p>
+    <w:p>
+      <w:pPr>
+        <w:pBdr>
+          <w:left w:val="single" w:color="1A5276" w:sz="6" w:space="1"/>
+        </w:pBdr>
+        <w:shd w:fill="F4F6F7" w:val="clear"/>
+        <w:spacing w:after="0" w:before="0"/>
+        <w:ind w:left="260" w:right="260"/>
+      </w:pPr>
+      <w:r>
+        <w:rPr>
+          <w:rFonts w:ascii="Courier New" w:hAnsi="Courier New"/>
+          <w:color w:val="1A252F"/>
+          <w:sz w:val="18"/>
+          <w:szCs w:val="18"/>
+        </w:rPr>
+        <w:t xml:space="preserve">always-auth=true</w:t>
+      </w:r>
+    </w:p>
+    <w:p>
+      <w:pPr>
+        <w:pBdr>
+          <w:left w:val="single" w:color="1A5276" w:sz="6" w:space="1"/>
+        </w:pBdr>
+        <w:shd w:fill="F4F6F7" w:val="clear"/>
+        <w:spacing w:after="0" w:before="0"/>
+        <w:ind w:left="260" w:right="260"/>
+      </w:pPr>
+      <w:r>
+        <w:rPr>
+          <w:rFonts w:ascii="Courier New" w:hAnsi="Courier New"/>
+          <w:color w:val="1A252F"/>
+          <w:sz w:val="18"/>
+          <w:szCs w:val="18"/>
+        </w:rPr>
+        <w:t xml:space="preserve">cafile=C:\Users\ss71872\cacerts.jks</w:t>
+      </w:r>
+    </w:p>
+    <w:p>
+      <w:pPr>
+        <w:pBdr>
+          <w:left w:val="single" w:color="1A5276" w:sz="6" w:space="1"/>
+        </w:pBdr>
+        <w:shd w:fill="F4F6F7" w:val="clear"/>
+        <w:spacing w:after="0" w:before="0"/>
+        <w:ind w:left="260" w:right="260"/>
+      </w:pPr>
+      <w:r>
+        <w:rPr>
+          <w:rFonts w:ascii="Courier New" w:hAnsi="Courier New"/>
+          <w:color w:val="1A252F"/>
+          <w:sz w:val="18"/>
+          <w:szCs w:val="18"/>
+        </w:rPr>
+        <w:t xml:space="preserve">prefix=C:\Users\ss71872\AppData\Roaming\npm</w:t>
+      </w:r>
+    </w:p>
+    <w:p>
+      <w:pPr>
+        <w:pBdr>
+          <w:left w:val="single" w:color="1A5276" w:sz="6" w:space="1"/>
+        </w:pBdr>
+        <w:shd w:fill="F4F6F7" w:val="clear"/>
+        <w:spacing w:after="0" w:before="0"/>
+        <w:ind w:left="260" w:right="260"/>
+      </w:pPr>
+      <w:r>
+        <w:rPr>
+          <w:rFonts w:ascii="Courier New" w:hAnsi="Courier New"/>
+          <w:color w:val="1A252F"/>
+          <w:sz w:val="18"/>
+          <w:szCs w:val="18"/>
+        </w:rPr>
+        <w:t xml:space="preserve"/>
       </w:r>
     </w:p>
     <w:p>
@@ -1525,7 +1639,7 @@
           <w:sz w:val="18"/>
           <w:szCs w:val="18"/>
         </w:rPr>
-        <w:t xml:space="preserve">  Never hardcode the token. Use ${NPM_AUTH_TOKEN} and set it as an environment variable.</w:t>
+        <w:t xml:space="preserve">  Never hardcode the token. Use ${NPM_AUTH_TOKEN} and set it as an environment variable. Your token is the JWT value from your existing project .npmrc (the eyJ... string on line 2).</w:t>
       </w:r>
     </w:p>
     <w:p>
@@ -1611,7 +1725,7 @@
           <w:sz w:val="18"/>
           <w:szCs w:val="18"/>
         </w:rPr>
-        <w:t xml:space="preserve">export NPM_AUTH_TOKEN=your-artifactory-api-token</w:t>
+        <w:t xml:space="preserve">export NPM_AUTH_TOKEN=your-citi-artifactory-api-token</w:t>
       </w:r>
     </w:p>
     <w:p>
@@ -1669,7 +1783,7 @@
           <w:sz w:val="18"/>
           <w:szCs w:val="18"/>
         </w:rPr>
-        <w:t xml:space="preserve">$env:NPM_AUTH_TOKEN = "your-artifactory-api-token"</w:t>
+        <w:t xml:space="preserve">$env:NPM_AUTH_TOKEN = "your-citi-artifactory-api-token"</w:t>
       </w:r>
     </w:p>
     <w:p>
@@ -1736,7 +1850,7 @@
           <w:sz w:val="18"/>
           <w:szCs w:val="18"/>
         </w:rPr>
-        <w:t xml:space="preserve">npm login --registry=https://your-org.jfrog.io/artifactory/api/npm/npm-local/</w:t>
+        <w:t xml:space="preserve">npm login --registry=https://www.artifactrepository.citigroup.net/artifactory/api/npm/npm-teamdev/</w:t>
       </w:r>
     </w:p>
     <w:p>
@@ -1813,7 +1927,7 @@
           <w:sz w:val="18"/>
           <w:szCs w:val="18"/>
         </w:rPr>
-        <w:t xml:space="preserve">npm whoami --registry=https://your-org.jfrog.io/artifactory/api/npm/npm-local/</w:t>
+        <w:t xml:space="preserve">npm whoami --registry=https://www.artifactrepository.citigroup.net/artifactory/api/npm/npm-teamdev/</w:t>
       </w:r>
     </w:p>
     <w:p>
@@ -2603,7 +2717,7 @@
           <w:sz w:val="18"/>
           <w:szCs w:val="18"/>
         </w:rPr>
-        <w:t xml:space="preserve">registry=https://your-org.jfrog.io/artifactory/api/npm/npm-local/</w:t>
+        <w:t xml:space="preserve">registry=https://www.artifactrepository.citigroup.net/artifactory/api/npm/npm-teamdev/</w:t>
       </w:r>
     </w:p>
     <w:p>
@@ -2623,7 +2737,103 @@
           <w:sz w:val="18"/>
           <w:szCs w:val="18"/>
         </w:rPr>
-        <w:t xml:space="preserve">//your-org.jfrog.io/artifactory/api/npm/npm-local/:_authToken=${NPM_AUTH_TOKEN}</w:t>
+        <w:t xml:space="preserve">//www.artifactrepository.citigroup.net/artifactory/api/npm/npm-teamdev/:_authToken=${NPM_AUTH_TOKEN}</w:t>
+      </w:r>
+    </w:p>
+    <w:p>
+      <w:pPr>
+        <w:pBdr>
+          <w:left w:val="single" w:color="1A5276" w:sz="6" w:space="1"/>
+        </w:pBdr>
+        <w:shd w:fill="F4F6F7" w:val="clear"/>
+        <w:spacing w:after="0" w:before="0"/>
+        <w:ind w:left="260" w:right="260"/>
+      </w:pPr>
+      <w:r>
+        <w:rPr>
+          <w:rFonts w:ascii="Courier New" w:hAnsi="Courier New"/>
+          <w:color w:val="1A252F"/>
+          <w:sz w:val="18"/>
+          <w:szCs w:val="18"/>
+        </w:rPr>
+        <w:t xml:space="preserve">strict-ssl=false</w:t>
+      </w:r>
+    </w:p>
+    <w:p>
+      <w:pPr>
+        <w:pBdr>
+          <w:left w:val="single" w:color="1A5276" w:sz="6" w:space="1"/>
+        </w:pBdr>
+        <w:shd w:fill="F4F6F7" w:val="clear"/>
+        <w:spacing w:after="0" w:before="0"/>
+        <w:ind w:left="260" w:right="260"/>
+      </w:pPr>
+      <w:r>
+        <w:rPr>
+          <w:rFonts w:ascii="Courier New" w:hAnsi="Courier New"/>
+          <w:color w:val="1A252F"/>
+          <w:sz w:val="18"/>
+          <w:szCs w:val="18"/>
+        </w:rPr>
+        <w:t xml:space="preserve">email=ss71872@citi.com</w:t>
+      </w:r>
+    </w:p>
+    <w:p>
+      <w:pPr>
+        <w:pBdr>
+          <w:left w:val="single" w:color="1A5276" w:sz="6" w:space="1"/>
+        </w:pBdr>
+        <w:shd w:fill="F4F6F7" w:val="clear"/>
+        <w:spacing w:after="0" w:before="0"/>
+        <w:ind w:left="260" w:right="260"/>
+      </w:pPr>
+      <w:r>
+        <w:rPr>
+          <w:rFonts w:ascii="Courier New" w:hAnsi="Courier New"/>
+          <w:color w:val="1A252F"/>
+          <w:sz w:val="18"/>
+          <w:szCs w:val="18"/>
+        </w:rPr>
+        <w:t xml:space="preserve">always-auth=true</w:t>
+      </w:r>
+    </w:p>
+    <w:p>
+      <w:pPr>
+        <w:pBdr>
+          <w:left w:val="single" w:color="1A5276" w:sz="6" w:space="1"/>
+        </w:pBdr>
+        <w:shd w:fill="F4F6F7" w:val="clear"/>
+        <w:spacing w:after="0" w:before="0"/>
+        <w:ind w:left="260" w:right="260"/>
+      </w:pPr>
+      <w:r>
+        <w:rPr>
+          <w:rFonts w:ascii="Courier New" w:hAnsi="Courier New"/>
+          <w:color w:val="1A252F"/>
+          <w:sz w:val="18"/>
+          <w:szCs w:val="18"/>
+        </w:rPr>
+        <w:t xml:space="preserve">cafile=C:\Users\ss71872\cacerts.jks</w:t>
+      </w:r>
+    </w:p>
+    <w:p>
+      <w:pPr>
+        <w:pBdr>
+          <w:bottom w:val="single" w:color="BDC3C7" w:sz="1"/>
+          <w:left w:val="single" w:color="1A5276" w:sz="6" w:space="1"/>
+        </w:pBdr>
+        <w:shd w:fill="F4F6F7" w:val="clear"/>
+        <w:spacing w:after="80" w:before="0"/>
+        <w:ind w:left="260" w:right="260"/>
+      </w:pPr>
+      <w:r>
+        <w:rPr>
+          <w:rFonts w:ascii="Courier New" w:hAnsi="Courier New"/>
+          <w:color w:val="1A252F"/>
+          <w:sz w:val="18"/>
+          <w:szCs w:val="18"/>
+        </w:rPr>
+        <w:t xml:space="preserve">prefix=C:\Users\ss71872\AppData\Roaming\npm</w:t>
       </w:r>
     </w:p>
     <w:p>

</xml_diff>